<commit_message>
final update of code for publication
</commit_message>
<xml_diff>
--- a/02_programs/Missing-SDG-Gender-Indicators_2019_2023.docx
+++ b/02_programs/Missing-SDG-Gender-Indicators_2019_2023.docx
@@ -107,7 +107,7 @@
         <w:pStyle w:val="Date"/>
       </w:pPr>
       <w:r>
-        <w:t xml:space="preserve">2024-10-30</w:t>
+        <w:t xml:space="preserve">2025-01-07</w:t>
       </w:r>
     </w:p>
     <w:p>
@@ -477,7 +477,7 @@
         <w:pStyle w:val="BodyText"/>
       </w:pPr>
       <w:r>
-        <w:t xml:space="preserve">For example, of the 32 gender-related indicators which are sex disaggregated, if countries which had a population estimate also had a sex-disaggregated estimate (almost always, if not always, feasible), the SDG gender coverage rate would be 4670.7% instead of 3756.1%.</w:t>
+        <w:t xml:space="preserve">For example, of the 32 gender-related indicators which are sex disaggregated, if countries which had a population estimate also had a sex-disaggregated estimate (almost always, if not always, feasible), the SDG gender coverage rate would be 4690.6% instead of 3772.4%.</w:t>
       </w:r>
     </w:p>
     <w:bookmarkEnd w:id="28"/>
@@ -14489,7 +14489,7 @@
               <w:jc w:val="left"/>
             </w:pPr>
             <w:r>
-              <w:t xml:space="preserve">19.16***</w:t>
+              <w:t xml:space="preserve">19.19***</w:t>
             </w:r>
           </w:p>
         </w:tc>
@@ -14501,7 +14501,7 @@
               <w:jc w:val="left"/>
             </w:pPr>
             <w:r>
-              <w:t xml:space="preserve">43.12***</w:t>
+              <w:t xml:space="preserve">42.90***</w:t>
             </w:r>
           </w:p>
         </w:tc>
@@ -14513,7 +14513,7 @@
               <w:jc w:val="left"/>
             </w:pPr>
             <w:r>
-              <w:t xml:space="preserve">39.57***</w:t>
+              <w:t xml:space="preserve">39.73***</w:t>
             </w:r>
           </w:p>
         </w:tc>
@@ -14525,7 +14525,7 @@
               <w:jc w:val="left"/>
             </w:pPr>
             <w:r>
-              <w:t xml:space="preserve">48.51***</w:t>
+              <w:t xml:space="preserve">49.01***</w:t>
             </w:r>
           </w:p>
         </w:tc>
@@ -14537,7 +14537,7 @@
               <w:jc w:val="left"/>
             </w:pPr>
             <w:r>
-              <w:t xml:space="preserve">30.76*</w:t>
+              <w:t xml:space="preserve">31.28**</w:t>
             </w:r>
           </w:p>
         </w:tc>
@@ -14549,7 +14549,7 @@
               <w:jc w:val="left"/>
             </w:pPr>
             <w:r>
-              <w:t xml:space="preserve">-11.48</w:t>
+              <w:t xml:space="preserve">-10.60</w:t>
             </w:r>
           </w:p>
         </w:tc>
@@ -14561,7 +14561,7 @@
               <w:jc w:val="left"/>
             </w:pPr>
             <w:r>
-              <w:t xml:space="preserve">35.01+</w:t>
+              <w:t xml:space="preserve">35.61+</w:t>
             </w:r>
           </w:p>
         </w:tc>
@@ -14583,7 +14583,7 @@
               <w:jc w:val="left"/>
             </w:pPr>
             <w:r>
-              <w:t xml:space="preserve">(3.59)</w:t>
+              <w:t xml:space="preserve">(3.58)</w:t>
             </w:r>
           </w:p>
         </w:tc>
@@ -14607,7 +14607,7 @@
               <w:jc w:val="left"/>
             </w:pPr>
             <w:r>
-              <w:t xml:space="preserve">(2.26)</w:t>
+              <w:t xml:space="preserve">(2.25)</w:t>
             </w:r>
           </w:p>
         </w:tc>
@@ -14619,7 +14619,7 @@
               <w:jc w:val="left"/>
             </w:pPr>
             <w:r>
-              <w:t xml:space="preserve">(10.46)</w:t>
+              <w:t xml:space="preserve">(10.41)</w:t>
             </w:r>
           </w:p>
         </w:tc>
@@ -14631,7 +14631,7 @@
               <w:jc w:val="left"/>
             </w:pPr>
             <w:r>
-              <w:t xml:space="preserve">(11.93)</w:t>
+              <w:t xml:space="preserve">(11.88)</w:t>
             </w:r>
           </w:p>
         </w:tc>
@@ -14643,7 +14643,7 @@
               <w:jc w:val="left"/>
             </w:pPr>
             <w:r>
-              <w:t xml:space="preserve">(17.09)</w:t>
+              <w:t xml:space="preserve">(17.02)</w:t>
             </w:r>
           </w:p>
         </w:tc>
@@ -14655,7 +14655,7 @@
               <w:jc w:val="left"/>
             </w:pPr>
             <w:r>
-              <w:t xml:space="preserve">(18.34)</w:t>
+              <w:t xml:space="preserve">(18.21)</w:t>
             </w:r>
           </w:p>
         </w:tc>
@@ -14745,7 +14745,7 @@
               <w:jc w:val="left"/>
             </w:pPr>
             <w:r>
-              <w:t xml:space="preserve">0.65***</w:t>
+              <w:t xml:space="preserve">0.66***</w:t>
             </w:r>
           </w:p>
         </w:tc>
@@ -14865,7 +14865,7 @@
               <w:jc w:val="left"/>
             </w:pPr>
             <w:r>
-              <w:t xml:space="preserve">0.09</w:t>
+              <w:t xml:space="preserve">0.13</w:t>
             </w:r>
           </w:p>
         </w:tc>
@@ -14885,7 +14885,7 @@
               <w:jc w:val="left"/>
             </w:pPr>
             <w:r>
-              <w:t xml:space="preserve">-5.05***</w:t>
+              <w:t xml:space="preserve">-5.03***</w:t>
             </w:r>
           </w:p>
         </w:tc>
@@ -14897,7 +14897,7 @@
               <w:jc w:val="left"/>
             </w:pPr>
             <w:r>
-              <w:t xml:space="preserve">-4.29***</w:t>
+              <w:t xml:space="preserve">-4.27***</w:t>
             </w:r>
           </w:p>
         </w:tc>
@@ -14909,7 +14909,7 @@
               <w:jc w:val="left"/>
             </w:pPr>
             <w:r>
-              <w:t xml:space="preserve">-1.26</w:t>
+              <w:t xml:space="preserve">-1.27</w:t>
             </w:r>
           </w:p>
         </w:tc>
@@ -14921,7 +14921,7 @@
               <w:jc w:val="left"/>
             </w:pPr>
             <w:r>
-              <w:t xml:space="preserve">-4.35***</w:t>
+              <w:t xml:space="preserve">-4.32***</w:t>
             </w:r>
           </w:p>
         </w:tc>
@@ -14995,7 +14995,7 @@
               <w:jc w:val="left"/>
             </w:pPr>
             <w:r>
-              <w:t xml:space="preserve">(1.19)</w:t>
+              <w:t xml:space="preserve">(1.18)</w:t>
             </w:r>
           </w:p>
         </w:tc>
@@ -15007,7 +15007,7 @@
               <w:jc w:val="left"/>
             </w:pPr>
             <w:r>
-              <w:t xml:space="preserve">(1.03)</w:t>
+              <w:t xml:space="preserve">(1.02)</w:t>
             </w:r>
           </w:p>
         </w:tc>
@@ -15049,7 +15049,7 @@
               <w:jc w:val="left"/>
             </w:pPr>
             <w:r>
-              <w:t xml:space="preserve">7.99**</w:t>
+              <w:t xml:space="preserve">8.06**</w:t>
             </w:r>
           </w:p>
         </w:tc>
@@ -15069,7 +15069,7 @@
               <w:jc w:val="left"/>
             </w:pPr>
             <w:r>
-              <w:t xml:space="preserve">2.30</w:t>
+              <w:t xml:space="preserve">2.33</w:t>
             </w:r>
           </w:p>
         </w:tc>
@@ -15081,7 +15081,7 @@
               <w:jc w:val="left"/>
             </w:pPr>
             <w:r>
-              <w:t xml:space="preserve">4.31+</w:t>
+              <w:t xml:space="preserve">4.33*</w:t>
             </w:r>
           </w:p>
         </w:tc>
@@ -15093,7 +15093,7 @@
               <w:jc w:val="left"/>
             </w:pPr>
             <w:r>
-              <w:t xml:space="preserve">1.91</w:t>
+              <w:t xml:space="preserve">1.89</w:t>
             </w:r>
           </w:p>
         </w:tc>
@@ -15131,7 +15131,7 @@
               <w:jc w:val="left"/>
             </w:pPr>
             <w:r>
-              <w:t xml:space="preserve">(2.47)</w:t>
+              <w:t xml:space="preserve">(2.45)</w:t>
             </w:r>
           </w:p>
         </w:tc>
@@ -15151,7 +15151,7 @@
               <w:jc w:val="left"/>
             </w:pPr>
             <w:r>
-              <w:t xml:space="preserve">(2.57)</w:t>
+              <w:t xml:space="preserve">(2.54)</w:t>
             </w:r>
           </w:p>
         </w:tc>
@@ -15163,7 +15163,7 @@
               <w:jc w:val="left"/>
             </w:pPr>
             <w:r>
-              <w:t xml:space="preserve">(2.21)</w:t>
+              <w:t xml:space="preserve">(2.17)</w:t>
             </w:r>
           </w:p>
         </w:tc>
@@ -15175,7 +15175,7 @@
               <w:jc w:val="left"/>
             </w:pPr>
             <w:r>
-              <w:t xml:space="preserve">(3.12)</w:t>
+              <w:t xml:space="preserve">(3.07)</w:t>
             </w:r>
           </w:p>
         </w:tc>
@@ -15217,7 +15217,7 @@
               <w:jc w:val="left"/>
             </w:pPr>
             <w:r>
-              <w:t xml:space="preserve">6.98*</w:t>
+              <w:t xml:space="preserve">6.99*</w:t>
             </w:r>
           </w:p>
         </w:tc>
@@ -15237,7 +15237,7 @@
               <w:jc w:val="left"/>
             </w:pPr>
             <w:r>
-              <w:t xml:space="preserve">8.58***</w:t>
+              <w:t xml:space="preserve">8.59***</w:t>
             </w:r>
           </w:p>
         </w:tc>
@@ -15249,7 +15249,7 @@
               <w:jc w:val="left"/>
             </w:pPr>
             <w:r>
-              <w:t xml:space="preserve">4.99*</w:t>
+              <w:t xml:space="preserve">5.03*</w:t>
             </w:r>
           </w:p>
         </w:tc>
@@ -15261,7 +15261,7 @@
               <w:jc w:val="left"/>
             </w:pPr>
             <w:r>
-              <w:t xml:space="preserve">8.92**</w:t>
+              <w:t xml:space="preserve">8.93**</w:t>
             </w:r>
           </w:p>
         </w:tc>
@@ -15299,7 +15299,7 @@
               <w:jc w:val="left"/>
             </w:pPr>
             <w:r>
-              <w:t xml:space="preserve">(3.40)</w:t>
+              <w:t xml:space="preserve">(3.38)</w:t>
             </w:r>
           </w:p>
         </w:tc>
@@ -15319,7 +15319,7 @@
               <w:jc w:val="left"/>
             </w:pPr>
             <w:r>
-              <w:t xml:space="preserve">(2.50)</w:t>
+              <w:t xml:space="preserve">(2.48)</w:t>
             </w:r>
           </w:p>
         </w:tc>
@@ -15331,7 +15331,7 @@
               <w:jc w:val="left"/>
             </w:pPr>
             <w:r>
-              <w:t xml:space="preserve">(2.31)</w:t>
+              <w:t xml:space="preserve">(2.30)</w:t>
             </w:r>
           </w:p>
         </w:tc>
@@ -15343,7 +15343,7 @@
               <w:jc w:val="left"/>
             </w:pPr>
             <w:r>
-              <w:t xml:space="preserve">(3.27)</w:t>
+              <w:t xml:space="preserve">(3.22)</w:t>
             </w:r>
           </w:p>
         </w:tc>
@@ -15385,7 +15385,7 @@
               <w:jc w:val="left"/>
             </w:pPr>
             <w:r>
-              <w:t xml:space="preserve">-2.21</w:t>
+              <w:t xml:space="preserve">-2.15</w:t>
             </w:r>
           </w:p>
         </w:tc>
@@ -15405,7 +15405,7 @@
               <w:jc w:val="left"/>
             </w:pPr>
             <w:r>
-              <w:t xml:space="preserve">1.98</w:t>
+              <w:t xml:space="preserve">2.01</w:t>
             </w:r>
           </w:p>
         </w:tc>
@@ -15417,7 +15417,7 @@
               <w:jc w:val="left"/>
             </w:pPr>
             <w:r>
-              <w:t xml:space="preserve">2.31</w:t>
+              <w:t xml:space="preserve">2.38</w:t>
             </w:r>
           </w:p>
         </w:tc>
@@ -15429,7 +15429,7 @@
               <w:jc w:val="left"/>
             </w:pPr>
             <w:r>
-              <w:t xml:space="preserve">4.35</w:t>
+              <w:t xml:space="preserve">4.22</w:t>
             </w:r>
           </w:p>
         </w:tc>
@@ -15467,7 +15467,7 @@
               <w:jc w:val="left"/>
             </w:pPr>
             <w:r>
-              <w:t xml:space="preserve">(3.47)</w:t>
+              <w:t xml:space="preserve">(3.45)</w:t>
             </w:r>
           </w:p>
         </w:tc>
@@ -15487,7 +15487,7 @@
               <w:jc w:val="left"/>
             </w:pPr>
             <w:r>
-              <w:t xml:space="preserve">(2.47)</w:t>
+              <w:t xml:space="preserve">(2.46)</w:t>
             </w:r>
           </w:p>
         </w:tc>
@@ -15499,7 +15499,7 @@
               <w:jc w:val="left"/>
             </w:pPr>
             <w:r>
-              <w:t xml:space="preserve">(2.30)</w:t>
+              <w:t xml:space="preserve">(2.28)</w:t>
             </w:r>
           </w:p>
         </w:tc>
@@ -15511,7 +15511,7 @@
               <w:jc w:val="left"/>
             </w:pPr>
             <w:r>
-              <w:t xml:space="preserve">(3.06)</w:t>
+              <w:t xml:space="preserve">(3.03)</w:t>
             </w:r>
           </w:p>
         </w:tc>
@@ -15553,7 +15553,7 @@
               <w:jc w:val="left"/>
             </w:pPr>
             <w:r>
-              <w:t xml:space="preserve">0.08</w:t>
+              <w:t xml:space="preserve">0.27</w:t>
             </w:r>
           </w:p>
         </w:tc>
@@ -15573,7 +15573,7 @@
               <w:jc w:val="left"/>
             </w:pPr>
             <w:r>
-              <w:t xml:space="preserve">-8.79***</w:t>
+              <w:t xml:space="preserve">-8.55***</w:t>
             </w:r>
           </w:p>
         </w:tc>
@@ -15585,7 +15585,7 @@
               <w:jc w:val="left"/>
             </w:pPr>
             <w:r>
-              <w:t xml:space="preserve">-7.80***</w:t>
+              <w:t xml:space="preserve">-7.55**</w:t>
             </w:r>
           </w:p>
         </w:tc>
@@ -15597,7 +15597,7 @@
               <w:jc w:val="left"/>
             </w:pPr>
             <w:r>
-              <w:t xml:space="preserve">-8.57**</w:t>
+              <w:t xml:space="preserve">-8.31**</w:t>
             </w:r>
           </w:p>
         </w:tc>
@@ -15635,7 +15635,7 @@
               <w:jc w:val="left"/>
             </w:pPr>
             <w:r>
-              <w:t xml:space="preserve">(2.28)</w:t>
+              <w:t xml:space="preserve">(2.25)</w:t>
             </w:r>
           </w:p>
         </w:tc>
@@ -15655,7 +15655,679 @@
               <w:jc w:val="left"/>
             </w:pPr>
             <w:r>
-              <w:t xml:space="preserve">(2.60)</w:t>
+              <w:t xml:space="preserve">(2.53)</w:t>
+            </w:r>
+          </w:p>
+        </w:tc>
+        <w:tc>
+          <w:tcPr/>
+          <w:p>
+            <w:pPr>
+              <w:pStyle w:val="Compact"/>
+              <w:jc w:val="left"/>
+            </w:pPr>
+            <w:r>
+              <w:t xml:space="preserve">(2.34)</w:t>
+            </w:r>
+          </w:p>
+        </w:tc>
+        <w:tc>
+          <w:tcPr/>
+          <w:p>
+            <w:pPr>
+              <w:pStyle w:val="Compact"/>
+              <w:jc w:val="left"/>
+            </w:pPr>
+            <w:r>
+              <w:t xml:space="preserve">(2.77)</w:t>
+            </w:r>
+          </w:p>
+        </w:tc>
+      </w:tr>
+      <w:tr>
+        <w:tc>
+          <w:tcPr/>
+          <w:p>
+            <w:pPr>
+              <w:pStyle w:val="Compact"/>
+              <w:jc w:val="left"/>
+            </w:pPr>
+            <w:r>
+              <w:t xml:space="preserve">regionSouth Asia</w:t>
+            </w:r>
+          </w:p>
+        </w:tc>
+        <w:tc>
+          <w:tcPr/>
+          <w:p>
+            <w:pPr>
+              <w:pStyle w:val="Compact"/>
+            </w:pPr>
+          </w:p>
+        </w:tc>
+        <w:tc>
+          <w:tcPr/>
+          <w:p>
+            <w:pPr>
+              <w:pStyle w:val="Compact"/>
+            </w:pPr>
+          </w:p>
+        </w:tc>
+        <w:tc>
+          <w:tcPr/>
+          <w:p>
+            <w:pPr>
+              <w:pStyle w:val="Compact"/>
+              <w:jc w:val="left"/>
+            </w:pPr>
+            <w:r>
+              <w:t xml:space="preserve">5.02</w:t>
+            </w:r>
+          </w:p>
+        </w:tc>
+        <w:tc>
+          <w:tcPr/>
+          <w:p>
+            <w:pPr>
+              <w:pStyle w:val="Compact"/>
+            </w:pPr>
+          </w:p>
+        </w:tc>
+        <w:tc>
+          <w:tcPr/>
+          <w:p>
+            <w:pPr>
+              <w:pStyle w:val="Compact"/>
+              <w:jc w:val="left"/>
+            </w:pPr>
+            <w:r>
+              <w:t xml:space="preserve">5.00+</w:t>
+            </w:r>
+          </w:p>
+        </w:tc>
+        <w:tc>
+          <w:tcPr/>
+          <w:p>
+            <w:pPr>
+              <w:pStyle w:val="Compact"/>
+              <w:jc w:val="left"/>
+            </w:pPr>
+            <w:r>
+              <w:t xml:space="preserve">2.56</w:t>
+            </w:r>
+          </w:p>
+        </w:tc>
+        <w:tc>
+          <w:tcPr/>
+          <w:p>
+            <w:pPr>
+              <w:pStyle w:val="Compact"/>
+              <w:jc w:val="left"/>
+            </w:pPr>
+            <w:r>
+              <w:t xml:space="preserve">5.55</w:t>
+            </w:r>
+          </w:p>
+        </w:tc>
+      </w:tr>
+      <w:tr>
+        <w:tc>
+          <w:tcPr/>
+          <w:p>
+            <w:pPr>
+              <w:pStyle w:val="Compact"/>
+            </w:pPr>
+          </w:p>
+        </w:tc>
+        <w:tc>
+          <w:tcPr/>
+          <w:p>
+            <w:pPr>
+              <w:pStyle w:val="Compact"/>
+            </w:pPr>
+          </w:p>
+        </w:tc>
+        <w:tc>
+          <w:tcPr/>
+          <w:p>
+            <w:pPr>
+              <w:pStyle w:val="Compact"/>
+            </w:pPr>
+          </w:p>
+        </w:tc>
+        <w:tc>
+          <w:tcPr/>
+          <w:p>
+            <w:pPr>
+              <w:pStyle w:val="Compact"/>
+              <w:jc w:val="left"/>
+            </w:pPr>
+            <w:r>
+              <w:t xml:space="preserve">(3.51)</w:t>
+            </w:r>
+          </w:p>
+        </w:tc>
+        <w:tc>
+          <w:tcPr/>
+          <w:p>
+            <w:pPr>
+              <w:pStyle w:val="Compact"/>
+            </w:pPr>
+          </w:p>
+        </w:tc>
+        <w:tc>
+          <w:tcPr/>
+          <w:p>
+            <w:pPr>
+              <w:pStyle w:val="Compact"/>
+              <w:jc w:val="left"/>
+            </w:pPr>
+            <w:r>
+              <w:t xml:space="preserve">(3.01)</w:t>
+            </w:r>
+          </w:p>
+        </w:tc>
+        <w:tc>
+          <w:tcPr/>
+          <w:p>
+            <w:pPr>
+              <w:pStyle w:val="Compact"/>
+              <w:jc w:val="left"/>
+            </w:pPr>
+            <w:r>
+              <w:t xml:space="preserve">(2.86)</w:t>
+            </w:r>
+          </w:p>
+        </w:tc>
+        <w:tc>
+          <w:tcPr/>
+          <w:p>
+            <w:pPr>
+              <w:pStyle w:val="Compact"/>
+              <w:jc w:val="left"/>
+            </w:pPr>
+            <w:r>
+              <w:t xml:space="preserve">(3.80)</w:t>
+            </w:r>
+          </w:p>
+        </w:tc>
+      </w:tr>
+      <w:tr>
+        <w:tc>
+          <w:tcPr/>
+          <w:p>
+            <w:pPr>
+              <w:pStyle w:val="Compact"/>
+              <w:jc w:val="left"/>
+            </w:pPr>
+            <w:r>
+              <w:t xml:space="preserve">regionSub-Saharan Africa</w:t>
+            </w:r>
+          </w:p>
+        </w:tc>
+        <w:tc>
+          <w:tcPr/>
+          <w:p>
+            <w:pPr>
+              <w:pStyle w:val="Compact"/>
+            </w:pPr>
+          </w:p>
+        </w:tc>
+        <w:tc>
+          <w:tcPr/>
+          <w:p>
+            <w:pPr>
+              <w:pStyle w:val="Compact"/>
+            </w:pPr>
+          </w:p>
+        </w:tc>
+        <w:tc>
+          <w:tcPr/>
+          <w:p>
+            <w:pPr>
+              <w:pStyle w:val="Compact"/>
+              <w:jc w:val="left"/>
+            </w:pPr>
+            <w:r>
+              <w:t xml:space="preserve">4.36</w:t>
+            </w:r>
+          </w:p>
+        </w:tc>
+        <w:tc>
+          <w:tcPr/>
+          <w:p>
+            <w:pPr>
+              <w:pStyle w:val="Compact"/>
+            </w:pPr>
+          </w:p>
+        </w:tc>
+        <w:tc>
+          <w:tcPr/>
+          <w:p>
+            <w:pPr>
+              <w:pStyle w:val="Compact"/>
+              <w:jc w:val="left"/>
+            </w:pPr>
+            <w:r>
+              <w:t xml:space="preserve">6.41*</w:t>
+            </w:r>
+          </w:p>
+        </w:tc>
+        <w:tc>
+          <w:tcPr/>
+          <w:p>
+            <w:pPr>
+              <w:pStyle w:val="Compact"/>
+              <w:jc w:val="left"/>
+            </w:pPr>
+            <w:r>
+              <w:t xml:space="preserve">2.25</w:t>
+            </w:r>
+          </w:p>
+        </w:tc>
+        <w:tc>
+          <w:tcPr/>
+          <w:p>
+            <w:pPr>
+              <w:pStyle w:val="Compact"/>
+              <w:jc w:val="left"/>
+            </w:pPr>
+            <w:r>
+              <w:t xml:space="preserve">7.50*</w:t>
+            </w:r>
+          </w:p>
+        </w:tc>
+      </w:tr>
+      <w:tr>
+        <w:tc>
+          <w:tcPr/>
+          <w:p>
+            <w:pPr>
+              <w:pStyle w:val="Compact"/>
+            </w:pPr>
+          </w:p>
+        </w:tc>
+        <w:tc>
+          <w:tcPr/>
+          <w:p>
+            <w:pPr>
+              <w:pStyle w:val="Compact"/>
+            </w:pPr>
+          </w:p>
+        </w:tc>
+        <w:tc>
+          <w:tcPr/>
+          <w:p>
+            <w:pPr>
+              <w:pStyle w:val="Compact"/>
+            </w:pPr>
+          </w:p>
+        </w:tc>
+        <w:tc>
+          <w:tcPr/>
+          <w:p>
+            <w:pPr>
+              <w:pStyle w:val="Compact"/>
+              <w:jc w:val="left"/>
+            </w:pPr>
+            <w:r>
+              <w:t xml:space="preserve">(2.80)</w:t>
+            </w:r>
+          </w:p>
+        </w:tc>
+        <w:tc>
+          <w:tcPr/>
+          <w:p>
+            <w:pPr>
+              <w:pStyle w:val="Compact"/>
+            </w:pPr>
+          </w:p>
+        </w:tc>
+        <w:tc>
+          <w:tcPr/>
+          <w:p>
+            <w:pPr>
+              <w:pStyle w:val="Compact"/>
+              <w:jc w:val="left"/>
+            </w:pPr>
+            <w:r>
+              <w:t xml:space="preserve">(2.48)</w:t>
+            </w:r>
+          </w:p>
+        </w:tc>
+        <w:tc>
+          <w:tcPr/>
+          <w:p>
+            <w:pPr>
+              <w:pStyle w:val="Compact"/>
+              <w:jc w:val="left"/>
+            </w:pPr>
+            <w:r>
+              <w:t xml:space="preserve">(2.42)</w:t>
+            </w:r>
+          </w:p>
+        </w:tc>
+        <w:tc>
+          <w:tcPr/>
+          <w:p>
+            <w:pPr>
+              <w:pStyle w:val="Compact"/>
+              <w:jc w:val="left"/>
+            </w:pPr>
+            <w:r>
+              <w:t xml:space="preserve">(3.52)</w:t>
+            </w:r>
+          </w:p>
+        </w:tc>
+      </w:tr>
+      <w:tr>
+        <w:tc>
+          <w:tcPr/>
+          <w:p>
+            <w:pPr>
+              <w:pStyle w:val="Compact"/>
+              <w:jc w:val="left"/>
+            </w:pPr>
+            <w:r>
+              <w:t xml:space="preserve">Log Population</w:t>
+            </w:r>
+          </w:p>
+        </w:tc>
+        <w:tc>
+          <w:tcPr/>
+          <w:p>
+            <w:pPr>
+              <w:pStyle w:val="Compact"/>
+            </w:pPr>
+          </w:p>
+        </w:tc>
+        <w:tc>
+          <w:tcPr/>
+          <w:p>
+            <w:pPr>
+              <w:pStyle w:val="Compact"/>
+            </w:pPr>
+          </w:p>
+        </w:tc>
+        <w:tc>
+          <w:tcPr/>
+          <w:p>
+            <w:pPr>
+              <w:pStyle w:val="Compact"/>
+            </w:pPr>
+          </w:p>
+        </w:tc>
+        <w:tc>
+          <w:tcPr/>
+          <w:p>
+            <w:pPr>
+              <w:pStyle w:val="Compact"/>
+              <w:jc w:val="left"/>
+            </w:pPr>
+            <w:r>
+              <w:t xml:space="preserve">-0.06</w:t>
+            </w:r>
+          </w:p>
+        </w:tc>
+        <w:tc>
+          <w:tcPr/>
+          <w:p>
+            <w:pPr>
+              <w:pStyle w:val="Compact"/>
+              <w:jc w:val="left"/>
+            </w:pPr>
+            <w:r>
+              <w:t xml:space="preserve">0.23</w:t>
+            </w:r>
+          </w:p>
+        </w:tc>
+        <w:tc>
+          <w:tcPr/>
+          <w:p>
+            <w:pPr>
+              <w:pStyle w:val="Compact"/>
+              <w:jc w:val="left"/>
+            </w:pPr>
+            <w:r>
+              <w:t xml:space="preserve">-0.14</w:t>
+            </w:r>
+          </w:p>
+        </w:tc>
+        <w:tc>
+          <w:tcPr/>
+          <w:p>
+            <w:pPr>
+              <w:pStyle w:val="Compact"/>
+              <w:jc w:val="left"/>
+            </w:pPr>
+            <w:r>
+              <w:t xml:space="preserve">0.20</w:t>
+            </w:r>
+          </w:p>
+        </w:tc>
+      </w:tr>
+      <w:tr>
+        <w:tc>
+          <w:tcPr/>
+          <w:p>
+            <w:pPr>
+              <w:pStyle w:val="Compact"/>
+            </w:pPr>
+          </w:p>
+        </w:tc>
+        <w:tc>
+          <w:tcPr/>
+          <w:p>
+            <w:pPr>
+              <w:pStyle w:val="Compact"/>
+            </w:pPr>
+          </w:p>
+        </w:tc>
+        <w:tc>
+          <w:tcPr/>
+          <w:p>
+            <w:pPr>
+              <w:pStyle w:val="Compact"/>
+            </w:pPr>
+          </w:p>
+        </w:tc>
+        <w:tc>
+          <w:tcPr/>
+          <w:p>
+            <w:pPr>
+              <w:pStyle w:val="Compact"/>
+            </w:pPr>
+          </w:p>
+        </w:tc>
+        <w:tc>
+          <w:tcPr/>
+          <w:p>
+            <w:pPr>
+              <w:pStyle w:val="Compact"/>
+              <w:jc w:val="left"/>
+            </w:pPr>
+            <w:r>
+              <w:t xml:space="preserve">(0.49)</w:t>
+            </w:r>
+          </w:p>
+        </w:tc>
+        <w:tc>
+          <w:tcPr/>
+          <w:p>
+            <w:pPr>
+              <w:pStyle w:val="Compact"/>
+              <w:jc w:val="left"/>
+            </w:pPr>
+            <w:r>
+              <w:t xml:space="preserve">(0.50)</w:t>
+            </w:r>
+          </w:p>
+        </w:tc>
+        <w:tc>
+          <w:tcPr/>
+          <w:p>
+            <w:pPr>
+              <w:pStyle w:val="Compact"/>
+              <w:jc w:val="left"/>
+            </w:pPr>
+            <w:r>
+              <w:t xml:space="preserve">(0.45)</w:t>
+            </w:r>
+          </w:p>
+        </w:tc>
+        <w:tc>
+          <w:tcPr/>
+          <w:p>
+            <w:pPr>
+              <w:pStyle w:val="Compact"/>
+              <w:jc w:val="left"/>
+            </w:pPr>
+            <w:r>
+              <w:t xml:space="preserve">(0.55)</w:t>
+            </w:r>
+          </w:p>
+        </w:tc>
+      </w:tr>
+      <w:tr>
+        <w:tc>
+          <w:tcPr/>
+          <w:p>
+            <w:pPr>
+              <w:pStyle w:val="Compact"/>
+              <w:jc w:val="left"/>
+            </w:pPr>
+            <w:r>
+              <w:t xml:space="preserve">Population under 1.5 million</w:t>
+            </w:r>
+          </w:p>
+        </w:tc>
+        <w:tc>
+          <w:tcPr/>
+          <w:p>
+            <w:pPr>
+              <w:pStyle w:val="Compact"/>
+            </w:pPr>
+          </w:p>
+        </w:tc>
+        <w:tc>
+          <w:tcPr/>
+          <w:p>
+            <w:pPr>
+              <w:pStyle w:val="Compact"/>
+            </w:pPr>
+          </w:p>
+        </w:tc>
+        <w:tc>
+          <w:tcPr/>
+          <w:p>
+            <w:pPr>
+              <w:pStyle w:val="Compact"/>
+            </w:pPr>
+          </w:p>
+        </w:tc>
+        <w:tc>
+          <w:tcPr/>
+          <w:p>
+            <w:pPr>
+              <w:pStyle w:val="Compact"/>
+              <w:jc w:val="left"/>
+            </w:pPr>
+            <w:r>
+              <w:t xml:space="preserve">-3.66+</w:t>
+            </w:r>
+          </w:p>
+        </w:tc>
+        <w:tc>
+          <w:tcPr/>
+          <w:p>
+            <w:pPr>
+              <w:pStyle w:val="Compact"/>
+              <w:jc w:val="left"/>
+            </w:pPr>
+            <w:r>
+              <w:t xml:space="preserve">-2.26</w:t>
+            </w:r>
+          </w:p>
+        </w:tc>
+        <w:tc>
+          <w:tcPr/>
+          <w:p>
+            <w:pPr>
+              <w:pStyle w:val="Compact"/>
+              <w:jc w:val="left"/>
+            </w:pPr>
+            <w:r>
+              <w:t xml:space="preserve">-2.11</w:t>
+            </w:r>
+          </w:p>
+        </w:tc>
+        <w:tc>
+          <w:tcPr/>
+          <w:p>
+            <w:pPr>
+              <w:pStyle w:val="Compact"/>
+              <w:jc w:val="left"/>
+            </w:pPr>
+            <w:r>
+              <w:t xml:space="preserve">2.08</w:t>
+            </w:r>
+          </w:p>
+        </w:tc>
+      </w:tr>
+      <w:tr>
+        <w:tc>
+          <w:tcPr/>
+          <w:p>
+            <w:pPr>
+              <w:pStyle w:val="Compact"/>
+            </w:pPr>
+          </w:p>
+        </w:tc>
+        <w:tc>
+          <w:tcPr/>
+          <w:p>
+            <w:pPr>
+              <w:pStyle w:val="Compact"/>
+            </w:pPr>
+          </w:p>
+        </w:tc>
+        <w:tc>
+          <w:tcPr/>
+          <w:p>
+            <w:pPr>
+              <w:pStyle w:val="Compact"/>
+            </w:pPr>
+          </w:p>
+        </w:tc>
+        <w:tc>
+          <w:tcPr/>
+          <w:p>
+            <w:pPr>
+              <w:pStyle w:val="Compact"/>
+            </w:pPr>
+          </w:p>
+        </w:tc>
+        <w:tc>
+          <w:tcPr/>
+          <w:p>
+            <w:pPr>
+              <w:pStyle w:val="Compact"/>
+              <w:jc w:val="left"/>
+            </w:pPr>
+            <w:r>
+              <w:t xml:space="preserve">(2.19)</w:t>
+            </w:r>
+          </w:p>
+        </w:tc>
+        <w:tc>
+          <w:tcPr/>
+          <w:p>
+            <w:pPr>
+              <w:pStyle w:val="Compact"/>
+              <w:jc w:val="left"/>
+            </w:pPr>
+            <w:r>
+              <w:t xml:space="preserve">(2.35)</w:t>
             </w:r>
           </w:p>
         </w:tc>
@@ -15679,7 +16351,7 @@
               <w:jc w:val="left"/>
             </w:pPr>
             <w:r>
-              <w:t xml:space="preserve">(2.85)</w:t>
+              <w:t xml:space="preserve">(3.17)</w:t>
             </w:r>
           </w:p>
         </w:tc>
@@ -15693,8 +16365,16 @@
               <w:jc w:val="left"/>
             </w:pPr>
             <w:r>
-              <w:t xml:space="preserve">regionSouth Asia</w:t>
-            </w:r>
+              <w:t xml:space="preserve">Women Business and the Law Index Score (scale 1-100)</w:t>
+            </w:r>
+          </w:p>
+        </w:tc>
+        <w:tc>
+          <w:tcPr/>
+          <w:p>
+            <w:pPr>
+              <w:pStyle w:val="Compact"/>
+            </w:pPr>
           </w:p>
         </w:tc>
         <w:tc>
@@ -15721,16 +16401,8 @@
               <w:jc w:val="left"/>
             </w:pPr>
             <w:r>
-              <w:t xml:space="preserve">5.18</w:t>
-            </w:r>
-          </w:p>
-        </w:tc>
-        <w:tc>
-          <w:tcPr/>
-          <w:p>
-            <w:pPr>
-              <w:pStyle w:val="Compact"/>
-            </w:pPr>
+              <w:t xml:space="preserve">0.05</w:t>
+            </w:r>
           </w:p>
         </w:tc>
         <w:tc>
@@ -15741,7 +16413,7 @@
               <w:jc w:val="left"/>
             </w:pPr>
             <w:r>
-              <w:t xml:space="preserve">5.11+</w:t>
+              <w:t xml:space="preserve">0.01</w:t>
             </w:r>
           </w:p>
         </w:tc>
@@ -15753,7 +16425,7 @@
               <w:jc w:val="left"/>
             </w:pPr>
             <w:r>
-              <w:t xml:space="preserve">2.65</w:t>
+              <w:t xml:space="preserve">0.08</w:t>
             </w:r>
           </w:p>
         </w:tc>
@@ -15765,7 +16437,7 @@
               <w:jc w:val="left"/>
             </w:pPr>
             <w:r>
-              <w:t xml:space="preserve">5.68</w:t>
+              <w:t xml:space="preserve">-0.03</w:t>
             </w:r>
           </w:p>
         </w:tc>
@@ -15800,19 +16472,19 @@
           <w:p>
             <w:pPr>
               <w:pStyle w:val="Compact"/>
+            </w:pPr>
+          </w:p>
+        </w:tc>
+        <w:tc>
+          <w:tcPr/>
+          <w:p>
+            <w:pPr>
+              <w:pStyle w:val="Compact"/>
               <w:jc w:val="left"/>
             </w:pPr>
             <w:r>
-              <w:t xml:space="preserve">(3.52)</w:t>
-            </w:r>
-          </w:p>
-        </w:tc>
-        <w:tc>
-          <w:tcPr/>
-          <w:p>
-            <w:pPr>
-              <w:pStyle w:val="Compact"/>
-            </w:pPr>
+              <w:t xml:space="preserve">(0.04)</w:t>
+            </w:r>
           </w:p>
         </w:tc>
         <w:tc>
@@ -15823,7 +16495,7 @@
               <w:jc w:val="left"/>
             </w:pPr>
             <w:r>
-              <w:t xml:space="preserve">(3.02)</w:t>
+              <w:t xml:space="preserve">(0.05)</w:t>
             </w:r>
           </w:p>
         </w:tc>
@@ -15835,7 +16507,7 @@
               <w:jc w:val="left"/>
             </w:pPr>
             <w:r>
-              <w:t xml:space="preserve">(2.88)</w:t>
+              <w:t xml:space="preserve">(0.05)</w:t>
             </w:r>
           </w:p>
         </w:tc>
@@ -15847,7 +16519,7 @@
               <w:jc w:val="left"/>
             </w:pPr>
             <w:r>
-              <w:t xml:space="preserve">(3.80)</w:t>
+              <w:t xml:space="preserve">(0.08)</w:t>
             </w:r>
           </w:p>
         </w:tc>
@@ -15861,8 +16533,32 @@
               <w:jc w:val="left"/>
             </w:pPr>
             <w:r>
-              <w:t xml:space="preserve">regionSub-Saharan Africa</w:t>
-            </w:r>
+              <w:t xml:space="preserve">Gender Inequality Index</w:t>
+            </w:r>
+          </w:p>
+        </w:tc>
+        <w:tc>
+          <w:tcPr/>
+          <w:p>
+            <w:pPr>
+              <w:pStyle w:val="Compact"/>
+            </w:pPr>
+          </w:p>
+        </w:tc>
+        <w:tc>
+          <w:tcPr/>
+          <w:p>
+            <w:pPr>
+              <w:pStyle w:val="Compact"/>
+            </w:pPr>
+          </w:p>
+        </w:tc>
+        <w:tc>
+          <w:tcPr/>
+          <w:p>
+            <w:pPr>
+              <w:pStyle w:val="Compact"/>
+            </w:pPr>
           </w:p>
         </w:tc>
         <w:tc>
@@ -15889,52 +16585,16 @@
               <w:jc w:val="left"/>
             </w:pPr>
             <w:r>
-              <w:t xml:space="preserve">4.39</w:t>
-            </w:r>
-          </w:p>
-        </w:tc>
-        <w:tc>
-          <w:tcPr/>
-          <w:p>
-            <w:pPr>
-              <w:pStyle w:val="Compact"/>
-            </w:pPr>
-          </w:p>
-        </w:tc>
-        <w:tc>
-          <w:tcPr/>
-          <w:p>
-            <w:pPr>
-              <w:pStyle w:val="Compact"/>
-              <w:jc w:val="left"/>
-            </w:pPr>
-            <w:r>
-              <w:t xml:space="preserve">6.39*</w:t>
-            </w:r>
-          </w:p>
-        </w:tc>
-        <w:tc>
-          <w:tcPr/>
-          <w:p>
-            <w:pPr>
-              <w:pStyle w:val="Compact"/>
-              <w:jc w:val="left"/>
-            </w:pPr>
-            <w:r>
-              <w:t xml:space="preserve">2.19</w:t>
-            </w:r>
-          </w:p>
-        </w:tc>
-        <w:tc>
-          <w:tcPr/>
-          <w:p>
-            <w:pPr>
-              <w:pStyle w:val="Compact"/>
-              <w:jc w:val="left"/>
-            </w:pPr>
-            <w:r>
-              <w:t xml:space="preserve">7.47*</w:t>
-            </w:r>
+              <w:t xml:space="preserve">37.20***</w:t>
+            </w:r>
+          </w:p>
+        </w:tc>
+        <w:tc>
+          <w:tcPr/>
+          <w:p>
+            <w:pPr>
+              <w:pStyle w:val="Compact"/>
+            </w:pPr>
           </w:p>
         </w:tc>
       </w:tr>
@@ -15968,694 +16628,34 @@
           <w:p>
             <w:pPr>
               <w:pStyle w:val="Compact"/>
+            </w:pPr>
+          </w:p>
+        </w:tc>
+        <w:tc>
+          <w:tcPr/>
+          <w:p>
+            <w:pPr>
+              <w:pStyle w:val="Compact"/>
+            </w:pPr>
+          </w:p>
+        </w:tc>
+        <w:tc>
+          <w:tcPr/>
+          <w:p>
+            <w:pPr>
+              <w:pStyle w:val="Compact"/>
+            </w:pPr>
+          </w:p>
+        </w:tc>
+        <w:tc>
+          <w:tcPr/>
+          <w:p>
+            <w:pPr>
+              <w:pStyle w:val="Compact"/>
               <w:jc w:val="left"/>
             </w:pPr>
             <w:r>
-              <w:t xml:space="preserve">(2.82)</w:t>
-            </w:r>
-          </w:p>
-        </w:tc>
-        <w:tc>
-          <w:tcPr/>
-          <w:p>
-            <w:pPr>
-              <w:pStyle w:val="Compact"/>
-            </w:pPr>
-          </w:p>
-        </w:tc>
-        <w:tc>
-          <w:tcPr/>
-          <w:p>
-            <w:pPr>
-              <w:pStyle w:val="Compact"/>
-              <w:jc w:val="left"/>
-            </w:pPr>
-            <w:r>
-              <w:t xml:space="preserve">(2.49)</w:t>
-            </w:r>
-          </w:p>
-        </w:tc>
-        <w:tc>
-          <w:tcPr/>
-          <w:p>
-            <w:pPr>
-              <w:pStyle w:val="Compact"/>
-              <w:jc w:val="left"/>
-            </w:pPr>
-            <w:r>
-              <w:t xml:space="preserve">(2.42)</w:t>
-            </w:r>
-          </w:p>
-        </w:tc>
-        <w:tc>
-          <w:tcPr/>
-          <w:p>
-            <w:pPr>
-              <w:pStyle w:val="Compact"/>
-              <w:jc w:val="left"/>
-            </w:pPr>
-            <w:r>
-              <w:t xml:space="preserve">(3.55)</w:t>
-            </w:r>
-          </w:p>
-        </w:tc>
-      </w:tr>
-      <w:tr>
-        <w:tc>
-          <w:tcPr/>
-          <w:p>
-            <w:pPr>
-              <w:pStyle w:val="Compact"/>
-              <w:jc w:val="left"/>
-            </w:pPr>
-            <w:r>
-              <w:t xml:space="preserve">Log Population</w:t>
-            </w:r>
-          </w:p>
-        </w:tc>
-        <w:tc>
-          <w:tcPr/>
-          <w:p>
-            <w:pPr>
-              <w:pStyle w:val="Compact"/>
-            </w:pPr>
-          </w:p>
-        </w:tc>
-        <w:tc>
-          <w:tcPr/>
-          <w:p>
-            <w:pPr>
-              <w:pStyle w:val="Compact"/>
-            </w:pPr>
-          </w:p>
-        </w:tc>
-        <w:tc>
-          <w:tcPr/>
-          <w:p>
-            <w:pPr>
-              <w:pStyle w:val="Compact"/>
-            </w:pPr>
-          </w:p>
-        </w:tc>
-        <w:tc>
-          <w:tcPr/>
-          <w:p>
-            <w:pPr>
-              <w:pStyle w:val="Compact"/>
-              <w:jc w:val="left"/>
-            </w:pPr>
-            <w:r>
-              <w:t xml:space="preserve">-0.02</w:t>
-            </w:r>
-          </w:p>
-        </w:tc>
-        <w:tc>
-          <w:tcPr/>
-          <w:p>
-            <w:pPr>
-              <w:pStyle w:val="Compact"/>
-              <w:jc w:val="left"/>
-            </w:pPr>
-            <w:r>
-              <w:t xml:space="preserve">0.26</w:t>
-            </w:r>
-          </w:p>
-        </w:tc>
-        <w:tc>
-          <w:tcPr/>
-          <w:p>
-            <w:pPr>
-              <w:pStyle w:val="Compact"/>
-              <w:jc w:val="left"/>
-            </w:pPr>
-            <w:r>
-              <w:t xml:space="preserve">-0.11</w:t>
-            </w:r>
-          </w:p>
-        </w:tc>
-        <w:tc>
-          <w:tcPr/>
-          <w:p>
-            <w:pPr>
-              <w:pStyle w:val="Compact"/>
-              <w:jc w:val="left"/>
-            </w:pPr>
-            <w:r>
-              <w:t xml:space="preserve">0.26</w:t>
-            </w:r>
-          </w:p>
-        </w:tc>
-      </w:tr>
-      <w:tr>
-        <w:tc>
-          <w:tcPr/>
-          <w:p>
-            <w:pPr>
-              <w:pStyle w:val="Compact"/>
-            </w:pPr>
-          </w:p>
-        </w:tc>
-        <w:tc>
-          <w:tcPr/>
-          <w:p>
-            <w:pPr>
-              <w:pStyle w:val="Compact"/>
-            </w:pPr>
-          </w:p>
-        </w:tc>
-        <w:tc>
-          <w:tcPr/>
-          <w:p>
-            <w:pPr>
-              <w:pStyle w:val="Compact"/>
-            </w:pPr>
-          </w:p>
-        </w:tc>
-        <w:tc>
-          <w:tcPr/>
-          <w:p>
-            <w:pPr>
-              <w:pStyle w:val="Compact"/>
-            </w:pPr>
-          </w:p>
-        </w:tc>
-        <w:tc>
-          <w:tcPr/>
-          <w:p>
-            <w:pPr>
-              <w:pStyle w:val="Compact"/>
-              <w:jc w:val="left"/>
-            </w:pPr>
-            <w:r>
-              <w:t xml:space="preserve">(0.49)</w:t>
-            </w:r>
-          </w:p>
-        </w:tc>
-        <w:tc>
-          <w:tcPr/>
-          <w:p>
-            <w:pPr>
-              <w:pStyle w:val="Compact"/>
-              <w:jc w:val="left"/>
-            </w:pPr>
-            <w:r>
-              <w:t xml:space="preserve">(0.51)</w:t>
-            </w:r>
-          </w:p>
-        </w:tc>
-        <w:tc>
-          <w:tcPr/>
-          <w:p>
-            <w:pPr>
-              <w:pStyle w:val="Compact"/>
-              <w:jc w:val="left"/>
-            </w:pPr>
-            <w:r>
-              <w:t xml:space="preserve">(0.46)</w:t>
-            </w:r>
-          </w:p>
-        </w:tc>
-        <w:tc>
-          <w:tcPr/>
-          <w:p>
-            <w:pPr>
-              <w:pStyle w:val="Compact"/>
-              <w:jc w:val="left"/>
-            </w:pPr>
-            <w:r>
-              <w:t xml:space="preserve">(0.55)</w:t>
-            </w:r>
-          </w:p>
-        </w:tc>
-      </w:tr>
-      <w:tr>
-        <w:tc>
-          <w:tcPr/>
-          <w:p>
-            <w:pPr>
-              <w:pStyle w:val="Compact"/>
-              <w:jc w:val="left"/>
-            </w:pPr>
-            <w:r>
-              <w:t xml:space="preserve">Population under 1.5 million</w:t>
-            </w:r>
-          </w:p>
-        </w:tc>
-        <w:tc>
-          <w:tcPr/>
-          <w:p>
-            <w:pPr>
-              <w:pStyle w:val="Compact"/>
-            </w:pPr>
-          </w:p>
-        </w:tc>
-        <w:tc>
-          <w:tcPr/>
-          <w:p>
-            <w:pPr>
-              <w:pStyle w:val="Compact"/>
-            </w:pPr>
-          </w:p>
-        </w:tc>
-        <w:tc>
-          <w:tcPr/>
-          <w:p>
-            <w:pPr>
-              <w:pStyle w:val="Compact"/>
-            </w:pPr>
-          </w:p>
-        </w:tc>
-        <w:tc>
-          <w:tcPr/>
-          <w:p>
-            <w:pPr>
-              <w:pStyle w:val="Compact"/>
-              <w:jc w:val="left"/>
-            </w:pPr>
-            <w:r>
-              <w:t xml:space="preserve">-3.64+</w:t>
-            </w:r>
-          </w:p>
-        </w:tc>
-        <w:tc>
-          <w:tcPr/>
-          <w:p>
-            <w:pPr>
-              <w:pStyle w:val="Compact"/>
-              <w:jc w:val="left"/>
-            </w:pPr>
-            <w:r>
-              <w:t xml:space="preserve">-2.26</w:t>
-            </w:r>
-          </w:p>
-        </w:tc>
-        <w:tc>
-          <w:tcPr/>
-          <w:p>
-            <w:pPr>
-              <w:pStyle w:val="Compact"/>
-              <w:jc w:val="left"/>
-            </w:pPr>
-            <w:r>
-              <w:t xml:space="preserve">-2.12</w:t>
-            </w:r>
-          </w:p>
-        </w:tc>
-        <w:tc>
-          <w:tcPr/>
-          <w:p>
-            <w:pPr>
-              <w:pStyle w:val="Compact"/>
-              <w:jc w:val="left"/>
-            </w:pPr>
-            <w:r>
-              <w:t xml:space="preserve">1.93</w:t>
-            </w:r>
-          </w:p>
-        </w:tc>
-      </w:tr>
-      <w:tr>
-        <w:tc>
-          <w:tcPr/>
-          <w:p>
-            <w:pPr>
-              <w:pStyle w:val="Compact"/>
-            </w:pPr>
-          </w:p>
-        </w:tc>
-        <w:tc>
-          <w:tcPr/>
-          <w:p>
-            <w:pPr>
-              <w:pStyle w:val="Compact"/>
-            </w:pPr>
-          </w:p>
-        </w:tc>
-        <w:tc>
-          <w:tcPr/>
-          <w:p>
-            <w:pPr>
-              <w:pStyle w:val="Compact"/>
-            </w:pPr>
-          </w:p>
-        </w:tc>
-        <w:tc>
-          <w:tcPr/>
-          <w:p>
-            <w:pPr>
-              <w:pStyle w:val="Compact"/>
-            </w:pPr>
-          </w:p>
-        </w:tc>
-        <w:tc>
-          <w:tcPr/>
-          <w:p>
-            <w:pPr>
-              <w:pStyle w:val="Compact"/>
-              <w:jc w:val="left"/>
-            </w:pPr>
-            <w:r>
-              <w:t xml:space="preserve">(2.17)</w:t>
-            </w:r>
-          </w:p>
-        </w:tc>
-        <w:tc>
-          <w:tcPr/>
-          <w:p>
-            <w:pPr>
-              <w:pStyle w:val="Compact"/>
-              <w:jc w:val="left"/>
-            </w:pPr>
-            <w:r>
-              <w:t xml:space="preserve">(2.33)</w:t>
-            </w:r>
-          </w:p>
-        </w:tc>
-        <w:tc>
-          <w:tcPr/>
-          <w:p>
-            <w:pPr>
-              <w:pStyle w:val="Compact"/>
-              <w:jc w:val="left"/>
-            </w:pPr>
-            <w:r>
-              <w:t xml:space="preserve">(2.27)</w:t>
-            </w:r>
-          </w:p>
-        </w:tc>
-        <w:tc>
-          <w:tcPr/>
-          <w:p>
-            <w:pPr>
-              <w:pStyle w:val="Compact"/>
-              <w:jc w:val="left"/>
-            </w:pPr>
-            <w:r>
-              <w:t xml:space="preserve">(3.10)</w:t>
-            </w:r>
-          </w:p>
-        </w:tc>
-      </w:tr>
-      <w:tr>
-        <w:tc>
-          <w:tcPr/>
-          <w:p>
-            <w:pPr>
-              <w:pStyle w:val="Compact"/>
-              <w:jc w:val="left"/>
-            </w:pPr>
-            <w:r>
-              <w:t xml:space="preserve">Women Business and the Law Index Score (scale 1-100)</w:t>
-            </w:r>
-          </w:p>
-        </w:tc>
-        <w:tc>
-          <w:tcPr/>
-          <w:p>
-            <w:pPr>
-              <w:pStyle w:val="Compact"/>
-            </w:pPr>
-          </w:p>
-        </w:tc>
-        <w:tc>
-          <w:tcPr/>
-          <w:p>
-            <w:pPr>
-              <w:pStyle w:val="Compact"/>
-            </w:pPr>
-          </w:p>
-        </w:tc>
-        <w:tc>
-          <w:tcPr/>
-          <w:p>
-            <w:pPr>
-              <w:pStyle w:val="Compact"/>
-            </w:pPr>
-          </w:p>
-        </w:tc>
-        <w:tc>
-          <w:tcPr/>
-          <w:p>
-            <w:pPr>
-              <w:pStyle w:val="Compact"/>
-              <w:jc w:val="left"/>
-            </w:pPr>
-            <w:r>
-              <w:t xml:space="preserve">0.05</w:t>
-            </w:r>
-          </w:p>
-        </w:tc>
-        <w:tc>
-          <w:tcPr/>
-          <w:p>
-            <w:pPr>
-              <w:pStyle w:val="Compact"/>
-              <w:jc w:val="left"/>
-            </w:pPr>
-            <w:r>
-              <w:t xml:space="preserve">0.01</w:t>
-            </w:r>
-          </w:p>
-        </w:tc>
-        <w:tc>
-          <w:tcPr/>
-          <w:p>
-            <w:pPr>
-              <w:pStyle w:val="Compact"/>
-              <w:jc w:val="left"/>
-            </w:pPr>
-            <w:r>
-              <w:t xml:space="preserve">0.09+</w:t>
-            </w:r>
-          </w:p>
-        </w:tc>
-        <w:tc>
-          <w:tcPr/>
-          <w:p>
-            <w:pPr>
-              <w:pStyle w:val="Compact"/>
-              <w:jc w:val="left"/>
-            </w:pPr>
-            <w:r>
-              <w:t xml:space="preserve">-0.03</w:t>
-            </w:r>
-          </w:p>
-        </w:tc>
-      </w:tr>
-      <w:tr>
-        <w:tc>
-          <w:tcPr/>
-          <w:p>
-            <w:pPr>
-              <w:pStyle w:val="Compact"/>
-            </w:pPr>
-          </w:p>
-        </w:tc>
-        <w:tc>
-          <w:tcPr/>
-          <w:p>
-            <w:pPr>
-              <w:pStyle w:val="Compact"/>
-            </w:pPr>
-          </w:p>
-        </w:tc>
-        <w:tc>
-          <w:tcPr/>
-          <w:p>
-            <w:pPr>
-              <w:pStyle w:val="Compact"/>
-            </w:pPr>
-          </w:p>
-        </w:tc>
-        <w:tc>
-          <w:tcPr/>
-          <w:p>
-            <w:pPr>
-              <w:pStyle w:val="Compact"/>
-            </w:pPr>
-          </w:p>
-        </w:tc>
-        <w:tc>
-          <w:tcPr/>
-          <w:p>
-            <w:pPr>
-              <w:pStyle w:val="Compact"/>
-              <w:jc w:val="left"/>
-            </w:pPr>
-            <w:r>
-              <w:t xml:space="preserve">(0.04)</w:t>
-            </w:r>
-          </w:p>
-        </w:tc>
-        <w:tc>
-          <w:tcPr/>
-          <w:p>
-            <w:pPr>
-              <w:pStyle w:val="Compact"/>
-              <w:jc w:val="left"/>
-            </w:pPr>
-            <w:r>
-              <w:t xml:space="preserve">(0.05)</w:t>
-            </w:r>
-          </w:p>
-        </w:tc>
-        <w:tc>
-          <w:tcPr/>
-          <w:p>
-            <w:pPr>
-              <w:pStyle w:val="Compact"/>
-              <w:jc w:val="left"/>
-            </w:pPr>
-            <w:r>
-              <w:t xml:space="preserve">(0.05)</w:t>
-            </w:r>
-          </w:p>
-        </w:tc>
-        <w:tc>
-          <w:tcPr/>
-          <w:p>
-            <w:pPr>
-              <w:pStyle w:val="Compact"/>
-              <w:jc w:val="left"/>
-            </w:pPr>
-            <w:r>
-              <w:t xml:space="preserve">(0.08)</w:t>
-            </w:r>
-          </w:p>
-        </w:tc>
-      </w:tr>
-      <w:tr>
-        <w:tc>
-          <w:tcPr/>
-          <w:p>
-            <w:pPr>
-              <w:pStyle w:val="Compact"/>
-              <w:jc w:val="left"/>
-            </w:pPr>
-            <w:r>
-              <w:t xml:space="preserve">Gender Inequality Index</w:t>
-            </w:r>
-          </w:p>
-        </w:tc>
-        <w:tc>
-          <w:tcPr/>
-          <w:p>
-            <w:pPr>
-              <w:pStyle w:val="Compact"/>
-            </w:pPr>
-          </w:p>
-        </w:tc>
-        <w:tc>
-          <w:tcPr/>
-          <w:p>
-            <w:pPr>
-              <w:pStyle w:val="Compact"/>
-            </w:pPr>
-          </w:p>
-        </w:tc>
-        <w:tc>
-          <w:tcPr/>
-          <w:p>
-            <w:pPr>
-              <w:pStyle w:val="Compact"/>
-            </w:pPr>
-          </w:p>
-        </w:tc>
-        <w:tc>
-          <w:tcPr/>
-          <w:p>
-            <w:pPr>
-              <w:pStyle w:val="Compact"/>
-            </w:pPr>
-          </w:p>
-        </w:tc>
-        <w:tc>
-          <w:tcPr/>
-          <w:p>
-            <w:pPr>
-              <w:pStyle w:val="Compact"/>
-            </w:pPr>
-          </w:p>
-        </w:tc>
-        <w:tc>
-          <w:tcPr/>
-          <w:p>
-            <w:pPr>
-              <w:pStyle w:val="Compact"/>
-              <w:jc w:val="left"/>
-            </w:pPr>
-            <w:r>
-              <w:t xml:space="preserve">37.47***</w:t>
-            </w:r>
-          </w:p>
-        </w:tc>
-        <w:tc>
-          <w:tcPr/>
-          <w:p>
-            <w:pPr>
-              <w:pStyle w:val="Compact"/>
-            </w:pPr>
-          </w:p>
-        </w:tc>
-      </w:tr>
-      <w:tr>
-        <w:tc>
-          <w:tcPr/>
-          <w:p>
-            <w:pPr>
-              <w:pStyle w:val="Compact"/>
-            </w:pPr>
-          </w:p>
-        </w:tc>
-        <w:tc>
-          <w:tcPr/>
-          <w:p>
-            <w:pPr>
-              <w:pStyle w:val="Compact"/>
-            </w:pPr>
-          </w:p>
-        </w:tc>
-        <w:tc>
-          <w:tcPr/>
-          <w:p>
-            <w:pPr>
-              <w:pStyle w:val="Compact"/>
-            </w:pPr>
-          </w:p>
-        </w:tc>
-        <w:tc>
-          <w:tcPr/>
-          <w:p>
-            <w:pPr>
-              <w:pStyle w:val="Compact"/>
-            </w:pPr>
-          </w:p>
-        </w:tc>
-        <w:tc>
-          <w:tcPr/>
-          <w:p>
-            <w:pPr>
-              <w:pStyle w:val="Compact"/>
-            </w:pPr>
-          </w:p>
-        </w:tc>
-        <w:tc>
-          <w:tcPr/>
-          <w:p>
-            <w:pPr>
-              <w:pStyle w:val="Compact"/>
-            </w:pPr>
-          </w:p>
-        </w:tc>
-        <w:tc>
-          <w:tcPr/>
-          <w:p>
-            <w:pPr>
-              <w:pStyle w:val="Compact"/>
-              <w:jc w:val="left"/>
-            </w:pPr>
-            <w:r>
-              <w:t xml:space="preserve">(8.63)</w:t>
+              <w:t xml:space="preserve">(8.52)</w:t>
             </w:r>
           </w:p>
         </w:tc>
@@ -17584,7 +17584,7 @@
         <w:rPr>
           <w:rStyle w:val="VerbatimChar"/>
         </w:rPr>
-        <w:t xml:space="preserve">## [1] "Gender SDG Availability &amp; SPI Pillar 2 (Data services) Score: 0.56***"</w:t>
+        <w:t xml:space="preserve">## [1] "Gender SDG Availability &amp; SPI Pillar 2 (Data services) Score: 0.57***"</w:t>
       </w:r>
     </w:p>
     <w:p>
@@ -17617,7 +17617,7 @@
         <w:rPr>
           <w:rStyle w:val="VerbatimChar"/>
         </w:rPr>
-        <w:t xml:space="preserve">## [1] "Gender SDG Availability &amp; SPI Pillar 5 (Data infrastructure) Score: 0.45***"</w:t>
+        <w:t xml:space="preserve">## [1] "Gender SDG Availability &amp; SPI Pillar 5 (Data infrastructure) Score: 0.46***"</w:t>
       </w:r>
     </w:p>
     <w:bookmarkEnd w:id="80"/>

</xml_diff>